<commit_message>
Thêm slide project và sửa lại nhật kí
</commit_message>
<xml_diff>
--- a/Sonar_Return(Project_Final)/doc/Report.docx
+++ b/Sonar_Return(Project_Final)/doc/Report.docx
@@ -156,7 +156,7 @@
           <w:szCs w:val="32"/>
         </w:rPr>
         <w:drawing>
-          <wp:inline distT="0" distB="0" distL="0" distR="0" wp14:anchorId="5BC626A1" wp14:editId="70673B9D">
+          <wp:inline distT="0" distB="0" distL="0" distR="0" wp14:anchorId="5BC626A1" wp14:editId="3D2660D3">
             <wp:extent cx="1341120" cy="1345565"/>
             <wp:effectExtent l="0" t="0" r="0" b="6985"/>
             <wp:docPr id="1356038292" name="Hình ảnh 1" descr="Ảnh có chứa văn bản, Phông chữ, biểu tướngi, Đồ họa"/>
@@ -865,6 +865,170 @@
           <w:tab w:val="right" w:leader="dot" w:pos="9016"/>
         </w:tabs>
         <w:spacing w:line="360" w:lineRule="auto"/>
+      </w:pPr>
+      <w:r>
+        <w:rPr>
+          <w:rFonts w:asciiTheme="majorHAnsi" w:hAnsiTheme="majorHAnsi" w:cstheme="majorHAnsi"/>
+          <w:b/>
+          <w:bCs/>
+          <w:sz w:val="28"/>
+          <w:szCs w:val="28"/>
+        </w:rPr>
+        <w:fldChar w:fldCharType="begin"/>
+      </w:r>
+      <w:r>
+        <w:rPr>
+          <w:rFonts w:asciiTheme="majorHAnsi" w:hAnsiTheme="majorHAnsi" w:cstheme="majorHAnsi"/>
+          <w:b/>
+          <w:bCs/>
+          <w:sz w:val="28"/>
+          <w:szCs w:val="28"/>
+        </w:rPr>
+        <w:instrText xml:space="preserve"> TOC \o "1-2" \h \z \u </w:instrText>
+      </w:r>
+      <w:r>
+        <w:rPr>
+          <w:rFonts w:asciiTheme="majorHAnsi" w:hAnsiTheme="majorHAnsi" w:cstheme="majorHAnsi"/>
+          <w:b/>
+          <w:bCs/>
+          <w:sz w:val="28"/>
+          <w:szCs w:val="28"/>
+        </w:rPr>
+        <w:fldChar w:fldCharType="separate"/>
+      </w:r>
+      <w:hyperlink w:anchor="_Toc225886505" w:history="1">
+        <w:r>
+          <w:rPr>
+            <w:rStyle w:val="Hyperlink"/>
+            <w:rFonts w:asciiTheme="majorHAnsi" w:hAnsiTheme="majorHAnsi" w:cstheme="majorHAnsi"/>
+            <w:b/>
+            <w:bCs/>
+            <w:noProof/>
+            <w:sz w:val="28"/>
+            <w:szCs w:val="28"/>
+          </w:rPr>
+          <w:t>MỤC LỤC</w:t>
+        </w:r>
+        <w:r>
+          <w:rPr>
+            <w:rFonts w:asciiTheme="majorHAnsi" w:hAnsiTheme="majorHAnsi" w:cstheme="majorHAnsi"/>
+            <w:b/>
+            <w:bCs/>
+            <w:noProof/>
+            <w:webHidden/>
+            <w:sz w:val="28"/>
+            <w:szCs w:val="28"/>
+          </w:rPr>
+          <w:tab/>
+        </w:r>
+        <w:r>
+          <w:rPr>
+            <w:rFonts w:asciiTheme="majorHAnsi" w:hAnsiTheme="majorHAnsi" w:cstheme="majorHAnsi"/>
+            <w:b/>
+            <w:bCs/>
+            <w:noProof/>
+            <w:webHidden/>
+            <w:sz w:val="28"/>
+            <w:szCs w:val="28"/>
+          </w:rPr>
+          <w:fldChar w:fldCharType="begin"/>
+        </w:r>
+        <w:r>
+          <w:rPr>
+            <w:rFonts w:asciiTheme="majorHAnsi" w:hAnsiTheme="majorHAnsi" w:cstheme="majorHAnsi"/>
+            <w:b/>
+            <w:bCs/>
+            <w:noProof/>
+            <w:webHidden/>
+            <w:sz w:val="28"/>
+            <w:szCs w:val="28"/>
+          </w:rPr>
+          <w:instrText xml:space="preserve"> PAGEREF _Toc225886505 \h </w:instrText>
+        </w:r>
+        <w:r>
+          <w:rPr>
+            <w:rFonts w:asciiTheme="majorHAnsi" w:hAnsiTheme="majorHAnsi" w:cstheme="majorHAnsi"/>
+            <w:b/>
+            <w:bCs/>
+            <w:noProof/>
+            <w:webHidden/>
+            <w:sz w:val="28"/>
+            <w:szCs w:val="28"/>
+          </w:rPr>
+        </w:r>
+        <w:r>
+          <w:rPr>
+            <w:rFonts w:asciiTheme="majorHAnsi" w:hAnsiTheme="majorHAnsi" w:cstheme="majorHAnsi"/>
+            <w:b/>
+            <w:bCs/>
+            <w:noProof/>
+            <w:webHidden/>
+            <w:sz w:val="28"/>
+            <w:szCs w:val="28"/>
+          </w:rPr>
+          <w:fldChar w:fldCharType="separate"/>
+        </w:r>
+        <w:r>
+          <w:rPr>
+            <w:rFonts w:asciiTheme="majorHAnsi" w:hAnsiTheme="majorHAnsi" w:cstheme="majorHAnsi"/>
+            <w:b/>
+            <w:bCs/>
+            <w:noProof/>
+            <w:webHidden/>
+            <w:sz w:val="28"/>
+            <w:szCs w:val="28"/>
+          </w:rPr>
+          <w:t>ii</w:t>
+        </w:r>
+        <w:r>
+          <w:rPr>
+            <w:rFonts w:asciiTheme="majorHAnsi" w:hAnsiTheme="majorHAnsi" w:cstheme="majorHAnsi"/>
+            <w:b/>
+            <w:bCs/>
+            <w:noProof/>
+            <w:webHidden/>
+            <w:sz w:val="28"/>
+            <w:szCs w:val="28"/>
+          </w:rPr>
+          <w:fldChar w:fldCharType="end"/>
+        </w:r>
+      </w:hyperlink>
+    </w:p>
+    <w:p>
+      <w:pPr>
+        <w:rPr>
+          <w:b/>
+          <w:bCs/>
+          <w:sz w:val="28"/>
+          <w:szCs w:val="28"/>
+        </w:rPr>
+      </w:pPr>
+      <w:r>
+        <w:rPr>
+          <w:b/>
+          <w:bCs/>
+          <w:sz w:val="28"/>
+          <w:szCs w:val="28"/>
+        </w:rPr>
+        <w:t xml:space="preserve">Bảng phân công các thành viên trong </w:t>
+      </w:r>
+      <w:r>
+        <w:rPr>
+          <w:b/>
+          <w:bCs/>
+          <w:sz w:val="28"/>
+          <w:szCs w:val="28"/>
+        </w:rPr>
+        <w:t>nhóm ....................................iii</w:t>
+      </w:r>
+    </w:p>
+    <w:p>
+      <w:pPr>
+        <w:pStyle w:val="TOC1"/>
+        <w:tabs>
+          <w:tab w:val="right" w:leader="dot" w:pos="9016"/>
+        </w:tabs>
+        <w:spacing w:line="360" w:lineRule="auto"/>
         <w:rPr>
           <w:rFonts w:asciiTheme="majorHAnsi" w:eastAsiaTheme="minorEastAsia" w:hAnsiTheme="majorHAnsi" w:cstheme="majorHAnsi"/>
           <w:b/>
@@ -875,37 +1039,7 @@
           <w:lang w:eastAsia="vi-VN"/>
         </w:rPr>
       </w:pPr>
-      <w:r>
-        <w:rPr>
-          <w:rFonts w:asciiTheme="majorHAnsi" w:hAnsiTheme="majorHAnsi" w:cstheme="majorHAnsi"/>
-          <w:b/>
-          <w:bCs/>
-          <w:sz w:val="28"/>
-          <w:szCs w:val="28"/>
-        </w:rPr>
-        <w:fldChar w:fldCharType="begin"/>
-      </w:r>
-      <w:r>
-        <w:rPr>
-          <w:rFonts w:asciiTheme="majorHAnsi" w:hAnsiTheme="majorHAnsi" w:cstheme="majorHAnsi"/>
-          <w:b/>
-          <w:bCs/>
-          <w:sz w:val="28"/>
-          <w:szCs w:val="28"/>
-        </w:rPr>
-        <w:instrText xml:space="preserve"> TOC \o "1-2" \h \z \u </w:instrText>
-      </w:r>
-      <w:r>
-        <w:rPr>
-          <w:rFonts w:asciiTheme="majorHAnsi" w:hAnsiTheme="majorHAnsi" w:cstheme="majorHAnsi"/>
-          <w:b/>
-          <w:bCs/>
-          <w:sz w:val="28"/>
-          <w:szCs w:val="28"/>
-        </w:rPr>
-        <w:fldChar w:fldCharType="separate"/>
-      </w:r>
-      <w:hyperlink w:anchor="_Toc225886505" w:history="1">
+      <w:hyperlink w:anchor="_Toc225886506" w:history="1">
         <w:r>
           <w:rPr>
             <w:rStyle w:val="Hyperlink"/>
@@ -916,7 +1050,7 @@
             <w:sz w:val="28"/>
             <w:szCs w:val="28"/>
           </w:rPr>
-          <w:t>MỤC LỤC</w:t>
+          <w:t>I. GIỚI THIỆU</w:t>
         </w:r>
         <w:r>
           <w:rPr>
@@ -952,7 +1086,7 @@
             <w:sz w:val="28"/>
             <w:szCs w:val="28"/>
           </w:rPr>
-          <w:instrText xml:space="preserve"> PAGEREF _Toc225886505 \h </w:instrText>
+          <w:instrText xml:space="preserve"> PAGEREF _Toc225886506 \h </w:instrText>
         </w:r>
         <w:r>
           <w:rPr>
@@ -987,7 +1121,7 @@
             <w:sz w:val="28"/>
             <w:szCs w:val="28"/>
           </w:rPr>
-          <w:t>ii</w:t>
+          <w:t>1</w:t>
         </w:r>
         <w:r>
           <w:rPr>
@@ -1005,7 +1139,7 @@
     </w:p>
     <w:p>
       <w:pPr>
-        <w:pStyle w:val="TOC1"/>
+        <w:pStyle w:val="TOC2"/>
         <w:tabs>
           <w:tab w:val="right" w:leader="dot" w:pos="9016"/>
         </w:tabs>
@@ -1020,7 +1154,7 @@
           <w:lang w:eastAsia="vi-VN"/>
         </w:rPr>
       </w:pPr>
-      <w:hyperlink w:anchor="_Toc225886506" w:history="1">
+      <w:hyperlink w:anchor="_Toc225886507" w:history="1">
         <w:r>
           <w:rPr>
             <w:rStyle w:val="Hyperlink"/>
@@ -1031,7 +1165,7 @@
             <w:sz w:val="28"/>
             <w:szCs w:val="28"/>
           </w:rPr>
-          <w:t>I. GIỚI THIỆU</w:t>
+          <w:t>1.1. Định nghĩa vấn đề</w:t>
         </w:r>
         <w:r>
           <w:rPr>
@@ -1067,7 +1201,7 @@
             <w:sz w:val="28"/>
             <w:szCs w:val="28"/>
           </w:rPr>
-          <w:instrText xml:space="preserve"> PAGEREF _Toc225886506 \h </w:instrText>
+          <w:instrText xml:space="preserve"> PAGEREF _Toc225886507 \h </w:instrText>
         </w:r>
         <w:r>
           <w:rPr>
@@ -1135,7 +1269,7 @@
           <w:lang w:eastAsia="vi-VN"/>
         </w:rPr>
       </w:pPr>
-      <w:hyperlink w:anchor="_Toc225886507" w:history="1">
+      <w:hyperlink w:anchor="_Toc225886508" w:history="1">
         <w:r>
           <w:rPr>
             <w:rStyle w:val="Hyperlink"/>
@@ -1146,7 +1280,7 @@
             <w:sz w:val="28"/>
             <w:szCs w:val="28"/>
           </w:rPr>
-          <w:t>1.1. Định nghĩa vấn đề</w:t>
+          <w:t>1.2. Phân tích yêu cầu bài toán</w:t>
         </w:r>
         <w:r>
           <w:rPr>
@@ -1182,7 +1316,7 @@
             <w:sz w:val="28"/>
             <w:szCs w:val="28"/>
           </w:rPr>
-          <w:instrText xml:space="preserve"> PAGEREF _Toc225886507 \h </w:instrText>
+          <w:instrText xml:space="preserve"> PAGEREF _Toc225886508 \h </w:instrText>
         </w:r>
         <w:r>
           <w:rPr>
@@ -1250,7 +1384,7 @@
           <w:lang w:eastAsia="vi-VN"/>
         </w:rPr>
       </w:pPr>
-      <w:hyperlink w:anchor="_Toc225886508" w:history="1">
+      <w:hyperlink w:anchor="_Toc225886509" w:history="1">
         <w:r>
           <w:rPr>
             <w:rStyle w:val="Hyperlink"/>
@@ -1261,7 +1395,7 @@
             <w:sz w:val="28"/>
             <w:szCs w:val="28"/>
           </w:rPr>
-          <w:t>1.2. Phân tích yêu cầu bài toán</w:t>
+          <w:t>1.3. Xác định dữ liệu đầu vào và đầu ra</w:t>
         </w:r>
         <w:r>
           <w:rPr>
@@ -1297,7 +1431,7 @@
             <w:sz w:val="28"/>
             <w:szCs w:val="28"/>
           </w:rPr>
-          <w:instrText xml:space="preserve"> PAGEREF _Toc225886508 \h </w:instrText>
+          <w:instrText xml:space="preserve"> PAGEREF _Toc225886509 \h </w:instrText>
         </w:r>
         <w:r>
           <w:rPr>
@@ -1332,7 +1466,7 @@
             <w:sz w:val="28"/>
             <w:szCs w:val="28"/>
           </w:rPr>
-          <w:t>1</w:t>
+          <w:t>2</w:t>
         </w:r>
         <w:r>
           <w:rPr>
@@ -1350,7 +1484,7 @@
     </w:p>
     <w:p>
       <w:pPr>
-        <w:pStyle w:val="TOC2"/>
+        <w:pStyle w:val="TOC1"/>
         <w:tabs>
           <w:tab w:val="right" w:leader="dot" w:pos="9016"/>
         </w:tabs>
@@ -1365,7 +1499,7 @@
           <w:lang w:eastAsia="vi-VN"/>
         </w:rPr>
       </w:pPr>
-      <w:hyperlink w:anchor="_Toc225886509" w:history="1">
+      <w:hyperlink w:anchor="_Toc225886510" w:history="1">
         <w:r>
           <w:rPr>
             <w:rStyle w:val="Hyperlink"/>
@@ -1376,7 +1510,7 @@
             <w:sz w:val="28"/>
             <w:szCs w:val="28"/>
           </w:rPr>
-          <w:t>1.3. Xác định dữ liệu đầu vào và đầu ra</w:t>
+          <w:t>II. KHẢO SÁT VẤN ĐỀ</w:t>
         </w:r>
         <w:r>
           <w:rPr>
@@ -1412,7 +1546,7 @@
             <w:sz w:val="28"/>
             <w:szCs w:val="28"/>
           </w:rPr>
-          <w:instrText xml:space="preserve"> PAGEREF _Toc225886509 \h </w:instrText>
+          <w:instrText xml:space="preserve"> PAGEREF _Toc225886510 \h </w:instrText>
         </w:r>
         <w:r>
           <w:rPr>
@@ -1447,7 +1581,7 @@
             <w:sz w:val="28"/>
             <w:szCs w:val="28"/>
           </w:rPr>
-          <w:t>2</w:t>
+          <w:t>3</w:t>
         </w:r>
         <w:r>
           <w:rPr>
@@ -1465,7 +1599,7 @@
     </w:p>
     <w:p>
       <w:pPr>
-        <w:pStyle w:val="TOC1"/>
+        <w:pStyle w:val="TOC2"/>
         <w:tabs>
           <w:tab w:val="right" w:leader="dot" w:pos="9016"/>
         </w:tabs>
@@ -1480,7 +1614,7 @@
           <w:lang w:eastAsia="vi-VN"/>
         </w:rPr>
       </w:pPr>
-      <w:hyperlink w:anchor="_Toc225886510" w:history="1">
+      <w:hyperlink w:anchor="_Toc225886511" w:history="1">
         <w:r>
           <w:rPr>
             <w:rStyle w:val="Hyperlink"/>
@@ -1491,7 +1625,7 @@
             <w:sz w:val="28"/>
             <w:szCs w:val="28"/>
           </w:rPr>
-          <w:t>II. KHẢO SÁT VẤN ĐỀ</w:t>
+          <w:t>2.1. Phân tích đặc điểm và cấu trúc bộ dữ liệu sonar</w:t>
         </w:r>
         <w:r>
           <w:rPr>
@@ -1527,7 +1661,7 @@
             <w:sz w:val="28"/>
             <w:szCs w:val="28"/>
           </w:rPr>
-          <w:instrText xml:space="preserve"> PAGEREF _Toc225886510 \h </w:instrText>
+          <w:instrText xml:space="preserve"> PAGEREF _Toc225886511 \h </w:instrText>
         </w:r>
         <w:r>
           <w:rPr>
@@ -1595,7 +1729,7 @@
           <w:lang w:eastAsia="vi-VN"/>
         </w:rPr>
       </w:pPr>
-      <w:hyperlink w:anchor="_Toc225886511" w:history="1">
+      <w:hyperlink w:anchor="_Toc225886512" w:history="1">
         <w:r>
           <w:rPr>
             <w:rStyle w:val="Hyperlink"/>
@@ -1606,7 +1740,7 @@
             <w:sz w:val="28"/>
             <w:szCs w:val="28"/>
           </w:rPr>
-          <w:t>2.1. Phân tích đặc điểm và cấu trúc bộ dữ liệu sonar</w:t>
+          <w:t>2.2. Phân tích phân phối và tương quan của các đặc trưng dữ liệu</w:t>
         </w:r>
         <w:r>
           <w:rPr>
@@ -1642,7 +1776,7 @@
             <w:sz w:val="28"/>
             <w:szCs w:val="28"/>
           </w:rPr>
-          <w:instrText xml:space="preserve"> PAGEREF _Toc225886511 \h </w:instrText>
+          <w:instrText xml:space="preserve"> PAGEREF _Toc225886512 \h </w:instrText>
         </w:r>
         <w:r>
           <w:rPr>
@@ -1677,7 +1811,7 @@
             <w:sz w:val="28"/>
             <w:szCs w:val="28"/>
           </w:rPr>
-          <w:t>3</w:t>
+          <w:t>4</w:t>
         </w:r>
         <w:r>
           <w:rPr>
@@ -1710,7 +1844,7 @@
           <w:lang w:eastAsia="vi-VN"/>
         </w:rPr>
       </w:pPr>
-      <w:hyperlink w:anchor="_Toc225886512" w:history="1">
+      <w:hyperlink w:anchor="_Toc225886513" w:history="1">
         <w:r>
           <w:rPr>
             <w:rStyle w:val="Hyperlink"/>
@@ -1721,7 +1855,7 @@
             <w:sz w:val="28"/>
             <w:szCs w:val="28"/>
           </w:rPr>
-          <w:t>2.2. Phân tích phân phối và tương quan của các đặc trưng dữ liệu</w:t>
+          <w:t>2.3. Quy trình phân tách và chuẩn hóa dữ liệu thực nghiệm</w:t>
         </w:r>
         <w:r>
           <w:rPr>
@@ -1757,7 +1891,7 @@
             <w:sz w:val="28"/>
             <w:szCs w:val="28"/>
           </w:rPr>
-          <w:instrText xml:space="preserve"> PAGEREF _Toc225886512 \h </w:instrText>
+          <w:instrText xml:space="preserve"> PAGEREF _Toc225886513 \h </w:instrText>
         </w:r>
         <w:r>
           <w:rPr>
@@ -1792,7 +1926,7 @@
             <w:sz w:val="28"/>
             <w:szCs w:val="28"/>
           </w:rPr>
-          <w:t>4</w:t>
+          <w:t>7</w:t>
         </w:r>
         <w:r>
           <w:rPr>
@@ -1810,7 +1944,7 @@
     </w:p>
     <w:p>
       <w:pPr>
-        <w:pStyle w:val="TOC2"/>
+        <w:pStyle w:val="TOC1"/>
         <w:tabs>
           <w:tab w:val="right" w:leader="dot" w:pos="9016"/>
         </w:tabs>
@@ -1825,7 +1959,7 @@
           <w:lang w:eastAsia="vi-VN"/>
         </w:rPr>
       </w:pPr>
-      <w:hyperlink w:anchor="_Toc225886513" w:history="1">
+      <w:hyperlink w:anchor="_Toc225886514" w:history="1">
         <w:r>
           <w:rPr>
             <w:rStyle w:val="Hyperlink"/>
@@ -1836,7 +1970,7 @@
             <w:sz w:val="28"/>
             <w:szCs w:val="28"/>
           </w:rPr>
-          <w:t>2.3. Quy trình phân tách và chuẩn hóa dữ liệu thực nghiệm</w:t>
+          <w:t>III. THỰC NGHIỆM VÀ THẢO LUẬN</w:t>
         </w:r>
         <w:r>
           <w:rPr>
@@ -1872,7 +2006,7 @@
             <w:sz w:val="28"/>
             <w:szCs w:val="28"/>
           </w:rPr>
-          <w:instrText xml:space="preserve"> PAGEREF _Toc225886513 \h </w:instrText>
+          <w:instrText xml:space="preserve"> PAGEREF _Toc225886514 \h </w:instrText>
         </w:r>
         <w:r>
           <w:rPr>
@@ -1907,7 +2041,7 @@
             <w:sz w:val="28"/>
             <w:szCs w:val="28"/>
           </w:rPr>
-          <w:t>7</w:t>
+          <w:t>9</w:t>
         </w:r>
         <w:r>
           <w:rPr>
@@ -1925,7 +2059,7 @@
     </w:p>
     <w:p>
       <w:pPr>
-        <w:pStyle w:val="TOC1"/>
+        <w:pStyle w:val="TOC2"/>
         <w:tabs>
           <w:tab w:val="right" w:leader="dot" w:pos="9016"/>
         </w:tabs>
@@ -1940,7 +2074,7 @@
           <w:lang w:eastAsia="vi-VN"/>
         </w:rPr>
       </w:pPr>
-      <w:hyperlink w:anchor="_Toc225886514" w:history="1">
+      <w:hyperlink w:anchor="_Toc225886515" w:history="1">
         <w:r>
           <w:rPr>
             <w:rStyle w:val="Hyperlink"/>
@@ -1951,7 +2085,7 @@
             <w:sz w:val="28"/>
             <w:szCs w:val="28"/>
           </w:rPr>
-          <w:t>III. THỰC NGHIỆM VÀ THẢO LUẬN</w:t>
+          <w:t>3.1. Thiết lập tham số thực nghiệm và quy trình huấn luyện</w:t>
         </w:r>
         <w:r>
           <w:rPr>
@@ -1987,7 +2121,7 @@
             <w:sz w:val="28"/>
             <w:szCs w:val="28"/>
           </w:rPr>
-          <w:instrText xml:space="preserve"> PAGEREF _Toc225886514 \h </w:instrText>
+          <w:instrText xml:space="preserve"> PAGEREF _Toc225886515 \h </w:instrText>
         </w:r>
         <w:r>
           <w:rPr>
@@ -2055,7 +2189,7 @@
           <w:lang w:eastAsia="vi-VN"/>
         </w:rPr>
       </w:pPr>
-      <w:hyperlink w:anchor="_Toc225886515" w:history="1">
+      <w:hyperlink w:anchor="_Toc225886516" w:history="1">
         <w:r>
           <w:rPr>
             <w:rStyle w:val="Hyperlink"/>
@@ -2066,7 +2200,7 @@
             <w:sz w:val="28"/>
             <w:szCs w:val="28"/>
           </w:rPr>
-          <w:t>3.1. Thiết lập tham số thực nghiệm và quy trình huấn luyện</w:t>
+          <w:t>3.2. Phương pháp đánh giá và thước đo hiệu năng mô hình</w:t>
         </w:r>
         <w:r>
           <w:rPr>
@@ -2102,7 +2236,7 @@
             <w:sz w:val="28"/>
             <w:szCs w:val="28"/>
           </w:rPr>
-          <w:instrText xml:space="preserve"> PAGEREF _Toc225886515 \h </w:instrText>
+          <w:instrText xml:space="preserve"> PAGEREF _Toc225886516 \h </w:instrText>
         </w:r>
         <w:r>
           <w:rPr>
@@ -2137,7 +2271,7 @@
             <w:sz w:val="28"/>
             <w:szCs w:val="28"/>
           </w:rPr>
-          <w:t>9</w:t>
+          <w:t>10</w:t>
         </w:r>
         <w:r>
           <w:rPr>
@@ -2170,7 +2304,7 @@
           <w:lang w:eastAsia="vi-VN"/>
         </w:rPr>
       </w:pPr>
-      <w:hyperlink w:anchor="_Toc225886516" w:history="1">
+      <w:hyperlink w:anchor="_Toc225886517" w:history="1">
         <w:r>
           <w:rPr>
             <w:rStyle w:val="Hyperlink"/>
@@ -2181,7 +2315,7 @@
             <w:sz w:val="28"/>
             <w:szCs w:val="28"/>
           </w:rPr>
-          <w:t>3.2. Phương pháp đánh giá và thước đo hiệu năng mô hình</w:t>
+          <w:t>3.3. Đánh giá hiệu năng thuật toán và tối ưu hóa siêu tham số</w:t>
         </w:r>
         <w:r>
           <w:rPr>
@@ -2217,7 +2351,7 @@
             <w:sz w:val="28"/>
             <w:szCs w:val="28"/>
           </w:rPr>
-          <w:instrText xml:space="preserve"> PAGEREF _Toc225886516 \h </w:instrText>
+          <w:instrText xml:space="preserve"> PAGEREF _Toc225886517 \h </w:instrText>
         </w:r>
         <w:r>
           <w:rPr>
@@ -2270,7 +2404,7 @@
     </w:p>
     <w:p>
       <w:pPr>
-        <w:pStyle w:val="TOC2"/>
+        <w:pStyle w:val="TOC1"/>
         <w:tabs>
           <w:tab w:val="right" w:leader="dot" w:pos="9016"/>
         </w:tabs>
@@ -2285,7 +2419,7 @@
           <w:lang w:eastAsia="vi-VN"/>
         </w:rPr>
       </w:pPr>
-      <w:hyperlink w:anchor="_Toc225886517" w:history="1">
+      <w:hyperlink w:anchor="_Toc225886518" w:history="1">
         <w:r>
           <w:rPr>
             <w:rStyle w:val="Hyperlink"/>
@@ -2296,7 +2430,7 @@
             <w:sz w:val="28"/>
             <w:szCs w:val="28"/>
           </w:rPr>
-          <w:t>3.3. Đánh giá hiệu năng thuật toán và tối ưu hóa siêu tham số</w:t>
+          <w:t>IV. KẾT LUẬN VÀ HƯỚNG PHÁT TRIỂN</w:t>
         </w:r>
         <w:r>
           <w:rPr>
@@ -2332,7 +2466,7 @@
             <w:sz w:val="28"/>
             <w:szCs w:val="28"/>
           </w:rPr>
-          <w:instrText xml:space="preserve"> PAGEREF _Toc225886517 \h </w:instrText>
+          <w:instrText xml:space="preserve"> PAGEREF _Toc225886518 \h </w:instrText>
         </w:r>
         <w:r>
           <w:rPr>
@@ -2367,7 +2501,7 @@
             <w:sz w:val="28"/>
             <w:szCs w:val="28"/>
           </w:rPr>
-          <w:t>10</w:t>
+          <w:t>13</w:t>
         </w:r>
         <w:r>
           <w:rPr>
@@ -2385,7 +2519,7 @@
     </w:p>
     <w:p>
       <w:pPr>
-        <w:pStyle w:val="TOC1"/>
+        <w:pStyle w:val="TOC2"/>
         <w:tabs>
           <w:tab w:val="right" w:leader="dot" w:pos="9016"/>
         </w:tabs>
@@ -2400,7 +2534,7 @@
           <w:lang w:eastAsia="vi-VN"/>
         </w:rPr>
       </w:pPr>
-      <w:hyperlink w:anchor="_Toc225886518" w:history="1">
+      <w:hyperlink w:anchor="_Toc225886519" w:history="1">
         <w:r>
           <w:rPr>
             <w:rStyle w:val="Hyperlink"/>
@@ -2411,7 +2545,7 @@
             <w:sz w:val="28"/>
             <w:szCs w:val="28"/>
           </w:rPr>
-          <w:t>IV. KẾT LUẬN VÀ HƯỚNG PHÁT TRIỂN</w:t>
+          <w:t>4.1. Kết luận tổng quan về thực nghiệm</w:t>
         </w:r>
         <w:r>
           <w:rPr>
@@ -2447,7 +2581,7 @@
             <w:sz w:val="28"/>
             <w:szCs w:val="28"/>
           </w:rPr>
-          <w:instrText xml:space="preserve"> PAGEREF _Toc225886518 \h </w:instrText>
+          <w:instrText xml:space="preserve"> PAGEREF _Toc225886519 \h </w:instrText>
         </w:r>
         <w:r>
           <w:rPr>
@@ -2505,130 +2639,6 @@
           <w:tab w:val="right" w:leader="dot" w:pos="9016"/>
         </w:tabs>
         <w:spacing w:line="360" w:lineRule="auto"/>
-        <w:rPr>
-          <w:rFonts w:asciiTheme="majorHAnsi" w:eastAsiaTheme="minorEastAsia" w:hAnsiTheme="majorHAnsi" w:cstheme="majorHAnsi"/>
-          <w:b/>
-          <w:bCs/>
-          <w:noProof/>
-          <w:sz w:val="28"/>
-          <w:szCs w:val="28"/>
-          <w:lang w:eastAsia="vi-VN"/>
-        </w:rPr>
-      </w:pPr>
-      <w:hyperlink w:anchor="_Toc225886519" w:history="1">
-        <w:r>
-          <w:rPr>
-            <w:rStyle w:val="Hyperlink"/>
-            <w:rFonts w:asciiTheme="majorHAnsi" w:hAnsiTheme="majorHAnsi" w:cstheme="majorHAnsi"/>
-            <w:b/>
-            <w:bCs/>
-            <w:noProof/>
-            <w:sz w:val="28"/>
-            <w:szCs w:val="28"/>
-          </w:rPr>
-          <w:t>4.1. Kết luận tổng quan về thực nghiệm</w:t>
-        </w:r>
-        <w:r>
-          <w:rPr>
-            <w:rFonts w:asciiTheme="majorHAnsi" w:hAnsiTheme="majorHAnsi" w:cstheme="majorHAnsi"/>
-            <w:b/>
-            <w:bCs/>
-            <w:noProof/>
-            <w:webHidden/>
-            <w:sz w:val="28"/>
-            <w:szCs w:val="28"/>
-          </w:rPr>
-          <w:tab/>
-        </w:r>
-        <w:r>
-          <w:rPr>
-            <w:rFonts w:asciiTheme="majorHAnsi" w:hAnsiTheme="majorHAnsi" w:cstheme="majorHAnsi"/>
-            <w:b/>
-            <w:bCs/>
-            <w:noProof/>
-            <w:webHidden/>
-            <w:sz w:val="28"/>
-            <w:szCs w:val="28"/>
-          </w:rPr>
-          <w:fldChar w:fldCharType="begin"/>
-        </w:r>
-        <w:r>
-          <w:rPr>
-            <w:rFonts w:asciiTheme="majorHAnsi" w:hAnsiTheme="majorHAnsi" w:cstheme="majorHAnsi"/>
-            <w:b/>
-            <w:bCs/>
-            <w:noProof/>
-            <w:webHidden/>
-            <w:sz w:val="28"/>
-            <w:szCs w:val="28"/>
-          </w:rPr>
-          <w:instrText xml:space="preserve"> PAGEREF _Toc225886519 \h </w:instrText>
-        </w:r>
-        <w:r>
-          <w:rPr>
-            <w:rFonts w:asciiTheme="majorHAnsi" w:hAnsiTheme="majorHAnsi" w:cstheme="majorHAnsi"/>
-            <w:b/>
-            <w:bCs/>
-            <w:noProof/>
-            <w:webHidden/>
-            <w:sz w:val="28"/>
-            <w:szCs w:val="28"/>
-          </w:rPr>
-        </w:r>
-        <w:r>
-          <w:rPr>
-            <w:rFonts w:asciiTheme="majorHAnsi" w:hAnsiTheme="majorHAnsi" w:cstheme="majorHAnsi"/>
-            <w:b/>
-            <w:bCs/>
-            <w:noProof/>
-            <w:webHidden/>
-            <w:sz w:val="28"/>
-            <w:szCs w:val="28"/>
-          </w:rPr>
-          <w:fldChar w:fldCharType="separate"/>
-        </w:r>
-        <w:r>
-          <w:rPr>
-            <w:rFonts w:asciiTheme="majorHAnsi" w:hAnsiTheme="majorHAnsi" w:cstheme="majorHAnsi"/>
-            <w:b/>
-            <w:bCs/>
-            <w:noProof/>
-            <w:webHidden/>
-            <w:sz w:val="28"/>
-            <w:szCs w:val="28"/>
-          </w:rPr>
-          <w:t>13</w:t>
-        </w:r>
-        <w:r>
-          <w:rPr>
-            <w:rFonts w:asciiTheme="majorHAnsi" w:hAnsiTheme="majorHAnsi" w:cstheme="majorHAnsi"/>
-            <w:b/>
-            <w:bCs/>
-            <w:noProof/>
-            <w:webHidden/>
-            <w:sz w:val="28"/>
-            <w:szCs w:val="28"/>
-          </w:rPr>
-          <w:fldChar w:fldCharType="end"/>
-        </w:r>
-      </w:hyperlink>
-    </w:p>
-    <w:p>
-      <w:pPr>
-        <w:pStyle w:val="TOC2"/>
-        <w:tabs>
-          <w:tab w:val="right" w:leader="dot" w:pos="9016"/>
-        </w:tabs>
-        <w:spacing w:line="360" w:lineRule="auto"/>
-        <w:rPr>
-          <w:rFonts w:asciiTheme="majorHAnsi" w:eastAsiaTheme="minorEastAsia" w:hAnsiTheme="majorHAnsi" w:cstheme="majorHAnsi"/>
-          <w:b/>
-          <w:bCs/>
-          <w:noProof/>
-          <w:sz w:val="28"/>
-          <w:szCs w:val="28"/>
-          <w:lang w:eastAsia="vi-VN"/>
-        </w:rPr>
       </w:pPr>
       <w:hyperlink w:anchor="_Toc225886520" w:history="1">
         <w:r>
@@ -2759,6 +2769,1313 @@
         <w:br w:type="page"/>
       </w:r>
     </w:p>
+    <w:p>
+      <w:pPr>
+        <w:pStyle w:val="Kiu1"/>
+      </w:pPr>
+      <w:bookmarkStart w:id="1" w:name="_Toc225884702"/>
+      <w:bookmarkStart w:id="2" w:name="_Toc225886506"/>
+      <w:r>
+        <w:lastRenderedPageBreak/>
+        <w:br/>
+        <w:t>Bảng phân công vai trò của các thành viên.</w:t>
+      </w:r>
+    </w:p>
+    <w:tbl>
+      <w:tblPr>
+        <w:tblW w:w="9521" w:type="dxa"/>
+        <w:tblCellMar>
+          <w:top w:w="15" w:type="dxa"/>
+          <w:left w:w="15" w:type="dxa"/>
+          <w:bottom w:w="15" w:type="dxa"/>
+          <w:right w:w="15" w:type="dxa"/>
+        </w:tblCellMar>
+        <w:tblLook w:val="04A0" w:firstRow="1" w:lastRow="0" w:firstColumn="1" w:lastColumn="0" w:noHBand="0" w:noVBand="1"/>
+      </w:tblPr>
+      <w:tblGrid>
+        <w:gridCol w:w="616"/>
+        <w:gridCol w:w="2126"/>
+        <w:gridCol w:w="1424"/>
+        <w:gridCol w:w="5355"/>
+      </w:tblGrid>
+      <w:tr>
+        <w:trPr>
+          <w:trHeight w:val="316"/>
+        </w:trPr>
+        <w:tc>
+          <w:tcPr>
+            <w:tcW w:w="0" w:type="auto"/>
+            <w:tcBorders>
+              <w:top w:val="single" w:sz="8" w:space="0" w:color="000000"/>
+              <w:left w:val="single" w:sz="8" w:space="0" w:color="000000"/>
+              <w:bottom w:val="single" w:sz="8" w:space="0" w:color="000000"/>
+              <w:right w:val="single" w:sz="8" w:space="0" w:color="000000"/>
+            </w:tcBorders>
+            <w:tcMar>
+              <w:top w:w="100" w:type="dxa"/>
+              <w:left w:w="100" w:type="dxa"/>
+              <w:bottom w:w="100" w:type="dxa"/>
+              <w:right w:w="100" w:type="dxa"/>
+            </w:tcMar>
+            <w:hideMark/>
+          </w:tcPr>
+          <w:p>
+            <w:pPr>
+              <w:spacing w:after="0" w:line="240" w:lineRule="auto"/>
+              <w:rPr>
+                <w:rFonts w:ascii="Times New Roman" w:eastAsia="Times New Roman" w:hAnsi="Times New Roman" w:cs="Times New Roman"/>
+                <w:kern w:val="0"/>
+                <w:sz w:val="24"/>
+                <w:szCs w:val="24"/>
+                <w:lang w:val="en-US"/>
+                <w14:ligatures w14:val="none"/>
+              </w:rPr>
+            </w:pPr>
+            <w:r>
+              <w:rPr>
+                <w:rFonts w:ascii="Arial" w:eastAsia="Times New Roman" w:hAnsi="Arial" w:cs="Arial"/>
+                <w:b/>
+                <w:bCs/>
+                <w:color w:val="000000"/>
+                <w:kern w:val="0"/>
+                <w:lang w:val="en-US"/>
+                <w14:ligatures w14:val="none"/>
+              </w:rPr>
+              <w:t>STT</w:t>
+            </w:r>
+          </w:p>
+        </w:tc>
+        <w:tc>
+          <w:tcPr>
+            <w:tcW w:w="0" w:type="auto"/>
+            <w:tcBorders>
+              <w:top w:val="single" w:sz="8" w:space="0" w:color="000000"/>
+              <w:left w:val="single" w:sz="8" w:space="0" w:color="000000"/>
+              <w:bottom w:val="single" w:sz="8" w:space="0" w:color="000000"/>
+              <w:right w:val="single" w:sz="8" w:space="0" w:color="000000"/>
+            </w:tcBorders>
+            <w:tcMar>
+              <w:top w:w="100" w:type="dxa"/>
+              <w:left w:w="100" w:type="dxa"/>
+              <w:bottom w:w="100" w:type="dxa"/>
+              <w:right w:w="100" w:type="dxa"/>
+            </w:tcMar>
+            <w:hideMark/>
+          </w:tcPr>
+          <w:p>
+            <w:pPr>
+              <w:spacing w:after="0" w:line="240" w:lineRule="auto"/>
+              <w:rPr>
+                <w:rFonts w:ascii="Times New Roman" w:eastAsia="Times New Roman" w:hAnsi="Times New Roman" w:cs="Times New Roman"/>
+                <w:kern w:val="0"/>
+                <w:sz w:val="24"/>
+                <w:szCs w:val="24"/>
+                <w:lang w:val="en-US"/>
+                <w14:ligatures w14:val="none"/>
+              </w:rPr>
+            </w:pPr>
+            <w:r>
+              <w:rPr>
+                <w:rFonts w:ascii="Arial" w:eastAsia="Times New Roman" w:hAnsi="Arial" w:cs="Arial"/>
+                <w:b/>
+                <w:bCs/>
+                <w:color w:val="000000"/>
+                <w:kern w:val="0"/>
+                <w:lang w:val="en-US"/>
+                <w14:ligatures w14:val="none"/>
+              </w:rPr>
+              <w:t>Họ vs tên</w:t>
+            </w:r>
+          </w:p>
+        </w:tc>
+        <w:tc>
+          <w:tcPr>
+            <w:tcW w:w="0" w:type="auto"/>
+            <w:tcBorders>
+              <w:top w:val="single" w:sz="8" w:space="0" w:color="000000"/>
+              <w:left w:val="single" w:sz="8" w:space="0" w:color="000000"/>
+              <w:bottom w:val="single" w:sz="8" w:space="0" w:color="000000"/>
+              <w:right w:val="single" w:sz="8" w:space="0" w:color="000000"/>
+            </w:tcBorders>
+            <w:tcMar>
+              <w:top w:w="100" w:type="dxa"/>
+              <w:left w:w="100" w:type="dxa"/>
+              <w:bottom w:w="100" w:type="dxa"/>
+              <w:right w:w="100" w:type="dxa"/>
+            </w:tcMar>
+            <w:hideMark/>
+          </w:tcPr>
+          <w:p>
+            <w:pPr>
+              <w:spacing w:after="0" w:line="240" w:lineRule="auto"/>
+              <w:rPr>
+                <w:rFonts w:ascii="Times New Roman" w:eastAsia="Times New Roman" w:hAnsi="Times New Roman" w:cs="Times New Roman"/>
+                <w:kern w:val="0"/>
+                <w:sz w:val="24"/>
+                <w:szCs w:val="24"/>
+                <w:lang w:val="en-US"/>
+                <w14:ligatures w14:val="none"/>
+              </w:rPr>
+            </w:pPr>
+            <w:r>
+              <w:rPr>
+                <w:rFonts w:ascii="Arial" w:eastAsia="Times New Roman" w:hAnsi="Arial" w:cs="Arial"/>
+                <w:b/>
+                <w:bCs/>
+                <w:color w:val="000000"/>
+                <w:kern w:val="0"/>
+                <w:lang w:val="en-US"/>
+                <w14:ligatures w14:val="none"/>
+              </w:rPr>
+              <w:t>MSSV</w:t>
+            </w:r>
+          </w:p>
+        </w:tc>
+        <w:tc>
+          <w:tcPr>
+            <w:tcW w:w="0" w:type="auto"/>
+            <w:tcBorders>
+              <w:top w:val="single" w:sz="8" w:space="0" w:color="000000"/>
+              <w:left w:val="single" w:sz="8" w:space="0" w:color="000000"/>
+              <w:bottom w:val="single" w:sz="4" w:space="0" w:color="000000"/>
+              <w:right w:val="single" w:sz="8" w:space="0" w:color="000000"/>
+            </w:tcBorders>
+            <w:tcMar>
+              <w:top w:w="100" w:type="dxa"/>
+              <w:left w:w="100" w:type="dxa"/>
+              <w:bottom w:w="100" w:type="dxa"/>
+              <w:right w:w="100" w:type="dxa"/>
+            </w:tcMar>
+            <w:hideMark/>
+          </w:tcPr>
+          <w:p>
+            <w:pPr>
+              <w:spacing w:after="0" w:line="240" w:lineRule="auto"/>
+              <w:rPr>
+                <w:rFonts w:ascii="Times New Roman" w:eastAsia="Times New Roman" w:hAnsi="Times New Roman" w:cs="Times New Roman"/>
+                <w:kern w:val="0"/>
+                <w:sz w:val="24"/>
+                <w:szCs w:val="24"/>
+                <w:lang w:val="en-US"/>
+                <w14:ligatures w14:val="none"/>
+              </w:rPr>
+            </w:pPr>
+            <w:r>
+              <w:rPr>
+                <w:rFonts w:ascii="Arial" w:eastAsia="Times New Roman" w:hAnsi="Arial" w:cs="Arial"/>
+                <w:b/>
+                <w:bCs/>
+                <w:color w:val="000000"/>
+                <w:kern w:val="0"/>
+                <w:lang w:val="en-US"/>
+                <w14:ligatures w14:val="none"/>
+              </w:rPr>
+              <w:t>Phân công</w:t>
+            </w:r>
+          </w:p>
+        </w:tc>
+      </w:tr>
+      <w:tr>
+        <w:trPr>
+          <w:trHeight w:val="680"/>
+        </w:trPr>
+        <w:tc>
+          <w:tcPr>
+            <w:tcW w:w="0" w:type="auto"/>
+            <w:tcBorders>
+              <w:top w:val="single" w:sz="8" w:space="0" w:color="000000"/>
+              <w:left w:val="single" w:sz="8" w:space="0" w:color="000000"/>
+              <w:bottom w:val="single" w:sz="8" w:space="0" w:color="000000"/>
+              <w:right w:val="single" w:sz="8" w:space="0" w:color="000000"/>
+            </w:tcBorders>
+            <w:tcMar>
+              <w:top w:w="100" w:type="dxa"/>
+              <w:left w:w="100" w:type="dxa"/>
+              <w:bottom w:w="100" w:type="dxa"/>
+              <w:right w:w="100" w:type="dxa"/>
+            </w:tcMar>
+            <w:hideMark/>
+          </w:tcPr>
+          <w:p>
+            <w:pPr>
+              <w:spacing w:after="0" w:line="240" w:lineRule="auto"/>
+              <w:rPr>
+                <w:rFonts w:ascii="Times New Roman" w:eastAsia="Times New Roman" w:hAnsi="Times New Roman" w:cs="Times New Roman"/>
+                <w:kern w:val="0"/>
+                <w:sz w:val="24"/>
+                <w:szCs w:val="24"/>
+                <w:lang w:val="en-US"/>
+                <w14:ligatures w14:val="none"/>
+              </w:rPr>
+            </w:pPr>
+            <w:r>
+              <w:rPr>
+                <w:rFonts w:ascii="Arial" w:eastAsia="Times New Roman" w:hAnsi="Arial" w:cs="Arial"/>
+                <w:color w:val="000000"/>
+                <w:kern w:val="0"/>
+                <w:lang w:val="en-US"/>
+                <w14:ligatures w14:val="none"/>
+              </w:rPr>
+              <w:t>1</w:t>
+            </w:r>
+          </w:p>
+        </w:tc>
+        <w:tc>
+          <w:tcPr>
+            <w:tcW w:w="0" w:type="auto"/>
+            <w:tcBorders>
+              <w:top w:val="single" w:sz="8" w:space="0" w:color="000000"/>
+              <w:left w:val="single" w:sz="8" w:space="0" w:color="000000"/>
+              <w:bottom w:val="single" w:sz="8" w:space="0" w:color="000000"/>
+              <w:right w:val="single" w:sz="8" w:space="0" w:color="000000"/>
+            </w:tcBorders>
+            <w:tcMar>
+              <w:top w:w="100" w:type="dxa"/>
+              <w:left w:w="100" w:type="dxa"/>
+              <w:bottom w:w="100" w:type="dxa"/>
+              <w:right w:w="100" w:type="dxa"/>
+            </w:tcMar>
+            <w:hideMark/>
+          </w:tcPr>
+          <w:p>
+            <w:pPr>
+              <w:spacing w:after="0" w:line="240" w:lineRule="auto"/>
+              <w:rPr>
+                <w:rFonts w:ascii="Times New Roman" w:eastAsia="Times New Roman" w:hAnsi="Times New Roman" w:cs="Times New Roman"/>
+                <w:kern w:val="0"/>
+                <w:sz w:val="24"/>
+                <w:szCs w:val="24"/>
+                <w:lang w:val="en-US"/>
+                <w14:ligatures w14:val="none"/>
+              </w:rPr>
+            </w:pPr>
+            <w:r>
+              <w:rPr>
+                <w:rFonts w:ascii="Arial" w:eastAsia="Times New Roman" w:hAnsi="Arial" w:cs="Arial"/>
+                <w:color w:val="000000"/>
+                <w:kern w:val="0"/>
+                <w:lang w:val="en-US"/>
+                <w14:ligatures w14:val="none"/>
+              </w:rPr>
+              <w:t>Nguyễn Thành Long</w:t>
+            </w:r>
+          </w:p>
+        </w:tc>
+        <w:tc>
+          <w:tcPr>
+            <w:tcW w:w="0" w:type="auto"/>
+            <w:tcBorders>
+              <w:top w:val="single" w:sz="8" w:space="0" w:color="000000"/>
+              <w:left w:val="single" w:sz="8" w:space="0" w:color="000000"/>
+              <w:bottom w:val="single" w:sz="8" w:space="0" w:color="000000"/>
+              <w:right w:val="single" w:sz="4" w:space="0" w:color="000000"/>
+            </w:tcBorders>
+            <w:tcMar>
+              <w:top w:w="100" w:type="dxa"/>
+              <w:left w:w="100" w:type="dxa"/>
+              <w:bottom w:w="100" w:type="dxa"/>
+              <w:right w:w="100" w:type="dxa"/>
+            </w:tcMar>
+            <w:hideMark/>
+          </w:tcPr>
+          <w:p>
+            <w:pPr>
+              <w:spacing w:after="0" w:line="240" w:lineRule="auto"/>
+              <w:rPr>
+                <w:rFonts w:ascii="Times New Roman" w:eastAsia="Times New Roman" w:hAnsi="Times New Roman" w:cs="Times New Roman"/>
+                <w:kern w:val="0"/>
+                <w:sz w:val="24"/>
+                <w:szCs w:val="24"/>
+                <w:lang w:val="en-US"/>
+                <w14:ligatures w14:val="none"/>
+              </w:rPr>
+            </w:pPr>
+            <w:r>
+              <w:rPr>
+                <w:rFonts w:ascii="Arial" w:eastAsia="Times New Roman" w:hAnsi="Arial" w:cs="Arial"/>
+                <w:color w:val="000000"/>
+                <w:kern w:val="0"/>
+                <w:lang w:val="en-US"/>
+                <w14:ligatures w14:val="none"/>
+              </w:rPr>
+              <w:t>3124410195</w:t>
+            </w:r>
+          </w:p>
+        </w:tc>
+        <w:tc>
+          <w:tcPr>
+            <w:tcW w:w="0" w:type="auto"/>
+            <w:tcBorders>
+              <w:top w:val="single" w:sz="4" w:space="0" w:color="000000"/>
+              <w:left w:val="single" w:sz="4" w:space="0" w:color="000000"/>
+              <w:bottom w:val="single" w:sz="4" w:space="0" w:color="000000"/>
+              <w:right w:val="single" w:sz="4" w:space="0" w:color="000000"/>
+            </w:tcBorders>
+            <w:tcMar>
+              <w:top w:w="100" w:type="dxa"/>
+              <w:left w:w="100" w:type="dxa"/>
+              <w:bottom w:w="100" w:type="dxa"/>
+              <w:right w:w="100" w:type="dxa"/>
+            </w:tcMar>
+            <w:hideMark/>
+          </w:tcPr>
+          <w:p>
+            <w:pPr>
+              <w:spacing w:before="240" w:after="240" w:line="240" w:lineRule="auto"/>
+              <w:rPr>
+                <w:rFonts w:ascii="Times New Roman" w:eastAsia="Times New Roman" w:hAnsi="Times New Roman" w:cs="Times New Roman"/>
+                <w:kern w:val="0"/>
+                <w:sz w:val="24"/>
+                <w:szCs w:val="24"/>
+                <w:lang w:val="en-US"/>
+                <w14:ligatures w14:val="none"/>
+              </w:rPr>
+            </w:pPr>
+            <w:r>
+              <w:rPr>
+                <w:rFonts w:ascii="Arial" w:eastAsia="Times New Roman" w:hAnsi="Arial" w:cs="Arial"/>
+                <w:color w:val="000000"/>
+                <w:kern w:val="0"/>
+                <w:lang w:val="en-US"/>
+                <w14:ligatures w14:val="none"/>
+              </w:rPr>
+              <w:t>- Lên kế hoạch, quản lý tiến độ và phân chia công việc.</w:t>
+            </w:r>
+          </w:p>
+          <w:p>
+            <w:pPr>
+              <w:spacing w:before="240" w:after="240" w:line="240" w:lineRule="auto"/>
+              <w:rPr>
+                <w:rFonts w:ascii="Times New Roman" w:eastAsia="Times New Roman" w:hAnsi="Times New Roman" w:cs="Times New Roman"/>
+                <w:kern w:val="0"/>
+                <w:sz w:val="24"/>
+                <w:szCs w:val="24"/>
+                <w:lang w:val="en-US"/>
+                <w14:ligatures w14:val="none"/>
+              </w:rPr>
+            </w:pPr>
+            <w:r>
+              <w:rPr>
+                <w:rFonts w:ascii="Arial" w:eastAsia="Times New Roman" w:hAnsi="Arial" w:cs="Arial"/>
+                <w:color w:val="000000"/>
+                <w:kern w:val="0"/>
+                <w:lang w:val="en-US"/>
+                <w14:ligatures w14:val="none"/>
+              </w:rPr>
+              <w:t xml:space="preserve">- Tổng hợp, kiểm tra và chỉnh sửa nội dung </w:t>
+            </w:r>
+            <w:proofErr w:type="gramStart"/>
+            <w:r>
+              <w:rPr>
+                <w:rFonts w:ascii="Arial" w:eastAsia="Times New Roman" w:hAnsi="Arial" w:cs="Arial"/>
+                <w:color w:val="000000"/>
+                <w:kern w:val="0"/>
+                <w:lang w:val="en-US"/>
+                <w14:ligatures w14:val="none"/>
+              </w:rPr>
+              <w:t>cuối .</w:t>
+            </w:r>
+            <w:proofErr w:type="gramEnd"/>
+          </w:p>
+          <w:p>
+            <w:pPr>
+              <w:spacing w:before="240" w:after="240" w:line="240" w:lineRule="auto"/>
+              <w:rPr>
+                <w:rFonts w:ascii="Times New Roman" w:eastAsia="Times New Roman" w:hAnsi="Times New Roman" w:cs="Times New Roman"/>
+                <w:kern w:val="0"/>
+                <w:sz w:val="24"/>
+                <w:szCs w:val="24"/>
+                <w:lang w:val="en-US"/>
+                <w14:ligatures w14:val="none"/>
+              </w:rPr>
+            </w:pPr>
+            <w:r>
+              <w:rPr>
+                <w:rFonts w:ascii="Arial" w:eastAsia="Times New Roman" w:hAnsi="Arial" w:cs="Arial"/>
+                <w:color w:val="000000"/>
+                <w:kern w:val="0"/>
+                <w:lang w:val="en-US"/>
+                <w14:ligatures w14:val="none"/>
+              </w:rPr>
+              <w:t>- Quản lý source code chung trên GitHub/GitLab.</w:t>
+            </w:r>
+          </w:p>
+        </w:tc>
+      </w:tr>
+      <w:tr>
+        <w:trPr>
+          <w:trHeight w:val="2424"/>
+        </w:trPr>
+        <w:tc>
+          <w:tcPr>
+            <w:tcW w:w="0" w:type="auto"/>
+            <w:tcBorders>
+              <w:top w:val="single" w:sz="8" w:space="0" w:color="000000"/>
+              <w:left w:val="single" w:sz="8" w:space="0" w:color="000000"/>
+              <w:bottom w:val="single" w:sz="8" w:space="0" w:color="000000"/>
+              <w:right w:val="single" w:sz="8" w:space="0" w:color="000000"/>
+            </w:tcBorders>
+            <w:tcMar>
+              <w:top w:w="100" w:type="dxa"/>
+              <w:left w:w="100" w:type="dxa"/>
+              <w:bottom w:w="100" w:type="dxa"/>
+              <w:right w:w="100" w:type="dxa"/>
+            </w:tcMar>
+            <w:hideMark/>
+          </w:tcPr>
+          <w:p>
+            <w:pPr>
+              <w:spacing w:after="0" w:line="240" w:lineRule="auto"/>
+              <w:rPr>
+                <w:rFonts w:ascii="Times New Roman" w:eastAsia="Times New Roman" w:hAnsi="Times New Roman" w:cs="Times New Roman"/>
+                <w:kern w:val="0"/>
+                <w:sz w:val="24"/>
+                <w:szCs w:val="24"/>
+                <w:lang w:val="en-US"/>
+                <w14:ligatures w14:val="none"/>
+              </w:rPr>
+            </w:pPr>
+            <w:r>
+              <w:rPr>
+                <w:rFonts w:ascii="Arial" w:eastAsia="Times New Roman" w:hAnsi="Arial" w:cs="Arial"/>
+                <w:color w:val="000000"/>
+                <w:kern w:val="0"/>
+                <w:lang w:val="en-US"/>
+                <w14:ligatures w14:val="none"/>
+              </w:rPr>
+              <w:t>2</w:t>
+            </w:r>
+          </w:p>
+        </w:tc>
+        <w:tc>
+          <w:tcPr>
+            <w:tcW w:w="0" w:type="auto"/>
+            <w:tcBorders>
+              <w:top w:val="single" w:sz="8" w:space="0" w:color="000000"/>
+              <w:left w:val="single" w:sz="8" w:space="0" w:color="000000"/>
+              <w:bottom w:val="single" w:sz="8" w:space="0" w:color="000000"/>
+              <w:right w:val="single" w:sz="8" w:space="0" w:color="000000"/>
+            </w:tcBorders>
+            <w:tcMar>
+              <w:top w:w="100" w:type="dxa"/>
+              <w:left w:w="100" w:type="dxa"/>
+              <w:bottom w:w="100" w:type="dxa"/>
+              <w:right w:w="100" w:type="dxa"/>
+            </w:tcMar>
+            <w:hideMark/>
+          </w:tcPr>
+          <w:p>
+            <w:pPr>
+              <w:spacing w:after="0" w:line="240" w:lineRule="auto"/>
+              <w:rPr>
+                <w:rFonts w:ascii="Times New Roman" w:eastAsia="Times New Roman" w:hAnsi="Times New Roman" w:cs="Times New Roman"/>
+                <w:kern w:val="0"/>
+                <w:sz w:val="24"/>
+                <w:szCs w:val="24"/>
+                <w:lang w:val="en-US"/>
+                <w14:ligatures w14:val="none"/>
+              </w:rPr>
+            </w:pPr>
+            <w:r>
+              <w:rPr>
+                <w:rFonts w:ascii="Arial" w:eastAsia="Times New Roman" w:hAnsi="Arial" w:cs="Arial"/>
+                <w:color w:val="000000"/>
+                <w:kern w:val="0"/>
+                <w:lang w:val="en-US"/>
+                <w14:ligatures w14:val="none"/>
+              </w:rPr>
+              <w:t>Trần Đăng Khoa</w:t>
+            </w:r>
+          </w:p>
+        </w:tc>
+        <w:tc>
+          <w:tcPr>
+            <w:tcW w:w="0" w:type="auto"/>
+            <w:tcBorders>
+              <w:top w:val="single" w:sz="8" w:space="0" w:color="000000"/>
+              <w:left w:val="single" w:sz="8" w:space="0" w:color="000000"/>
+              <w:bottom w:val="single" w:sz="8" w:space="0" w:color="000000"/>
+              <w:right w:val="single" w:sz="8" w:space="0" w:color="000000"/>
+            </w:tcBorders>
+            <w:tcMar>
+              <w:top w:w="100" w:type="dxa"/>
+              <w:left w:w="100" w:type="dxa"/>
+              <w:bottom w:w="100" w:type="dxa"/>
+              <w:right w:w="100" w:type="dxa"/>
+            </w:tcMar>
+            <w:hideMark/>
+          </w:tcPr>
+          <w:p>
+            <w:pPr>
+              <w:spacing w:after="0" w:line="240" w:lineRule="auto"/>
+              <w:rPr>
+                <w:rFonts w:ascii="Times New Roman" w:eastAsia="Times New Roman" w:hAnsi="Times New Roman" w:cs="Times New Roman"/>
+                <w:kern w:val="0"/>
+                <w:sz w:val="24"/>
+                <w:szCs w:val="24"/>
+                <w:lang w:val="en-US"/>
+                <w14:ligatures w14:val="none"/>
+              </w:rPr>
+            </w:pPr>
+            <w:r>
+              <w:rPr>
+                <w:rFonts w:ascii="Arial" w:eastAsia="Times New Roman" w:hAnsi="Arial" w:cs="Arial"/>
+                <w:color w:val="000000"/>
+                <w:kern w:val="0"/>
+                <w:lang w:val="en-US"/>
+                <w14:ligatures w14:val="none"/>
+              </w:rPr>
+              <w:t>3124410162</w:t>
+            </w:r>
+          </w:p>
+        </w:tc>
+        <w:tc>
+          <w:tcPr>
+            <w:tcW w:w="0" w:type="auto"/>
+            <w:tcBorders>
+              <w:top w:val="single" w:sz="4" w:space="0" w:color="000000"/>
+              <w:left w:val="single" w:sz="8" w:space="0" w:color="000000"/>
+              <w:bottom w:val="single" w:sz="8" w:space="0" w:color="000000"/>
+              <w:right w:val="single" w:sz="8" w:space="0" w:color="000000"/>
+            </w:tcBorders>
+            <w:tcMar>
+              <w:top w:w="100" w:type="dxa"/>
+              <w:left w:w="100" w:type="dxa"/>
+              <w:bottom w:w="100" w:type="dxa"/>
+              <w:right w:w="100" w:type="dxa"/>
+            </w:tcMar>
+            <w:hideMark/>
+          </w:tcPr>
+          <w:p>
+            <w:pPr>
+              <w:spacing w:before="240" w:after="240" w:line="240" w:lineRule="auto"/>
+              <w:rPr>
+                <w:rFonts w:ascii="Times New Roman" w:eastAsia="Times New Roman" w:hAnsi="Times New Roman" w:cs="Times New Roman"/>
+                <w:kern w:val="0"/>
+                <w:sz w:val="24"/>
+                <w:szCs w:val="24"/>
+                <w:lang w:val="en-US"/>
+                <w14:ligatures w14:val="none"/>
+              </w:rPr>
+            </w:pPr>
+            <w:r>
+              <w:rPr>
+                <w:rFonts w:ascii="Arial" w:eastAsia="Times New Roman" w:hAnsi="Arial" w:cs="Arial"/>
+                <w:color w:val="000000"/>
+                <w:kern w:val="0"/>
+                <w:lang w:val="en-US"/>
+                <w14:ligatures w14:val="none"/>
+              </w:rPr>
+              <w:t>- Quản lý và phân chia nội dung báo cáo. </w:t>
+            </w:r>
+          </w:p>
+          <w:p>
+            <w:pPr>
+              <w:spacing w:before="240" w:after="240" w:line="240" w:lineRule="auto"/>
+              <w:rPr>
+                <w:rFonts w:ascii="Times New Roman" w:eastAsia="Times New Roman" w:hAnsi="Times New Roman" w:cs="Times New Roman"/>
+                <w:kern w:val="0"/>
+                <w:sz w:val="24"/>
+                <w:szCs w:val="24"/>
+                <w:lang w:val="en-US"/>
+                <w14:ligatures w14:val="none"/>
+              </w:rPr>
+            </w:pPr>
+            <w:r>
+              <w:rPr>
+                <w:rFonts w:ascii="Arial" w:eastAsia="Times New Roman" w:hAnsi="Arial" w:cs="Arial"/>
+                <w:color w:val="000000"/>
+                <w:kern w:val="0"/>
+                <w:lang w:val="en-US"/>
+                <w14:ligatures w14:val="none"/>
+              </w:rPr>
+              <w:t>- Tổng hợp báo cáo và PPT từ các thành viên.</w:t>
+            </w:r>
+          </w:p>
+          <w:p>
+            <w:pPr>
+              <w:spacing w:before="240" w:after="240" w:line="240" w:lineRule="auto"/>
+              <w:rPr>
+                <w:rFonts w:ascii="Times New Roman" w:eastAsia="Times New Roman" w:hAnsi="Times New Roman" w:cs="Times New Roman"/>
+                <w:kern w:val="0"/>
+                <w:sz w:val="24"/>
+                <w:szCs w:val="24"/>
+                <w:lang w:val="en-US"/>
+                <w14:ligatures w14:val="none"/>
+              </w:rPr>
+            </w:pPr>
+            <w:r>
+              <w:rPr>
+                <w:rFonts w:ascii="Arial" w:eastAsia="Times New Roman" w:hAnsi="Arial" w:cs="Arial"/>
+                <w:color w:val="000000"/>
+                <w:kern w:val="0"/>
+                <w:lang w:val="en-US"/>
+                <w14:ligatures w14:val="none"/>
+              </w:rPr>
+              <w:t>- Viết nội dung: Phần giới thiệu (Báo cáo &amp; PPT).</w:t>
+            </w:r>
+          </w:p>
+          <w:p>
+            <w:pPr>
+              <w:spacing w:after="240" w:line="240" w:lineRule="auto"/>
+              <w:rPr>
+                <w:rFonts w:ascii="Times New Roman" w:eastAsia="Times New Roman" w:hAnsi="Times New Roman" w:cs="Times New Roman"/>
+                <w:kern w:val="0"/>
+                <w:sz w:val="24"/>
+                <w:szCs w:val="24"/>
+                <w:lang w:val="en-US"/>
+                <w14:ligatures w14:val="none"/>
+              </w:rPr>
+            </w:pPr>
+          </w:p>
+        </w:tc>
+      </w:tr>
+      <w:tr>
+        <w:trPr>
+          <w:trHeight w:val="927"/>
+        </w:trPr>
+        <w:tc>
+          <w:tcPr>
+            <w:tcW w:w="0" w:type="auto"/>
+            <w:tcBorders>
+              <w:top w:val="single" w:sz="8" w:space="0" w:color="000000"/>
+              <w:left w:val="single" w:sz="8" w:space="0" w:color="000000"/>
+              <w:bottom w:val="single" w:sz="8" w:space="0" w:color="000000"/>
+              <w:right w:val="single" w:sz="8" w:space="0" w:color="000000"/>
+            </w:tcBorders>
+            <w:tcMar>
+              <w:top w:w="100" w:type="dxa"/>
+              <w:left w:w="100" w:type="dxa"/>
+              <w:bottom w:w="100" w:type="dxa"/>
+              <w:right w:w="100" w:type="dxa"/>
+            </w:tcMar>
+            <w:hideMark/>
+          </w:tcPr>
+          <w:p>
+            <w:pPr>
+              <w:spacing w:after="0" w:line="240" w:lineRule="auto"/>
+              <w:rPr>
+                <w:rFonts w:ascii="Times New Roman" w:eastAsia="Times New Roman" w:hAnsi="Times New Roman" w:cs="Times New Roman"/>
+                <w:kern w:val="0"/>
+                <w:sz w:val="24"/>
+                <w:szCs w:val="24"/>
+                <w:lang w:val="en-US"/>
+                <w14:ligatures w14:val="none"/>
+              </w:rPr>
+            </w:pPr>
+            <w:r>
+              <w:rPr>
+                <w:rFonts w:ascii="Arial" w:eastAsia="Times New Roman" w:hAnsi="Arial" w:cs="Arial"/>
+                <w:color w:val="000000"/>
+                <w:kern w:val="0"/>
+                <w:lang w:val="en-US"/>
+                <w14:ligatures w14:val="none"/>
+              </w:rPr>
+              <w:t>3</w:t>
+            </w:r>
+          </w:p>
+        </w:tc>
+        <w:tc>
+          <w:tcPr>
+            <w:tcW w:w="0" w:type="auto"/>
+            <w:tcBorders>
+              <w:top w:val="single" w:sz="8" w:space="0" w:color="000000"/>
+              <w:left w:val="single" w:sz="8" w:space="0" w:color="000000"/>
+              <w:bottom w:val="single" w:sz="8" w:space="0" w:color="000000"/>
+              <w:right w:val="single" w:sz="8" w:space="0" w:color="000000"/>
+            </w:tcBorders>
+            <w:tcMar>
+              <w:top w:w="100" w:type="dxa"/>
+              <w:left w:w="100" w:type="dxa"/>
+              <w:bottom w:w="100" w:type="dxa"/>
+              <w:right w:w="100" w:type="dxa"/>
+            </w:tcMar>
+            <w:hideMark/>
+          </w:tcPr>
+          <w:p>
+            <w:pPr>
+              <w:spacing w:after="0" w:line="240" w:lineRule="auto"/>
+              <w:rPr>
+                <w:rFonts w:ascii="Times New Roman" w:eastAsia="Times New Roman" w:hAnsi="Times New Roman" w:cs="Times New Roman"/>
+                <w:kern w:val="0"/>
+                <w:sz w:val="24"/>
+                <w:szCs w:val="24"/>
+                <w:lang w:val="en-US"/>
+                <w14:ligatures w14:val="none"/>
+              </w:rPr>
+            </w:pPr>
+            <w:r>
+              <w:rPr>
+                <w:rFonts w:ascii="Arial" w:eastAsia="Times New Roman" w:hAnsi="Arial" w:cs="Arial"/>
+                <w:color w:val="000000"/>
+                <w:kern w:val="0"/>
+                <w:lang w:val="en-US"/>
+                <w14:ligatures w14:val="none"/>
+              </w:rPr>
+              <w:t>Hàng Vinh Quang</w:t>
+            </w:r>
+          </w:p>
+        </w:tc>
+        <w:tc>
+          <w:tcPr>
+            <w:tcW w:w="0" w:type="auto"/>
+            <w:tcBorders>
+              <w:top w:val="single" w:sz="8" w:space="0" w:color="000000"/>
+              <w:left w:val="single" w:sz="8" w:space="0" w:color="000000"/>
+              <w:bottom w:val="single" w:sz="8" w:space="0" w:color="000000"/>
+              <w:right w:val="single" w:sz="8" w:space="0" w:color="000000"/>
+            </w:tcBorders>
+            <w:tcMar>
+              <w:top w:w="100" w:type="dxa"/>
+              <w:left w:w="100" w:type="dxa"/>
+              <w:bottom w:w="100" w:type="dxa"/>
+              <w:right w:w="100" w:type="dxa"/>
+            </w:tcMar>
+            <w:hideMark/>
+          </w:tcPr>
+          <w:p>
+            <w:pPr>
+              <w:spacing w:after="0" w:line="240" w:lineRule="auto"/>
+              <w:rPr>
+                <w:rFonts w:ascii="Times New Roman" w:eastAsia="Times New Roman" w:hAnsi="Times New Roman" w:cs="Times New Roman"/>
+                <w:kern w:val="0"/>
+                <w:sz w:val="24"/>
+                <w:szCs w:val="24"/>
+                <w:lang w:val="en-US"/>
+                <w14:ligatures w14:val="none"/>
+              </w:rPr>
+            </w:pPr>
+            <w:r>
+              <w:rPr>
+                <w:rFonts w:ascii="Arial" w:eastAsia="Times New Roman" w:hAnsi="Arial" w:cs="Arial"/>
+                <w:color w:val="000000"/>
+                <w:kern w:val="0"/>
+                <w:lang w:val="en-US"/>
+                <w14:ligatures w14:val="none"/>
+              </w:rPr>
+              <w:t>3125720024</w:t>
+            </w:r>
+          </w:p>
+        </w:tc>
+        <w:tc>
+          <w:tcPr>
+            <w:tcW w:w="0" w:type="auto"/>
+            <w:tcBorders>
+              <w:top w:val="single" w:sz="8" w:space="0" w:color="000000"/>
+              <w:left w:val="single" w:sz="8" w:space="0" w:color="000000"/>
+              <w:bottom w:val="single" w:sz="8" w:space="0" w:color="000000"/>
+              <w:right w:val="single" w:sz="8" w:space="0" w:color="000000"/>
+            </w:tcBorders>
+            <w:tcMar>
+              <w:top w:w="100" w:type="dxa"/>
+              <w:left w:w="100" w:type="dxa"/>
+              <w:bottom w:w="100" w:type="dxa"/>
+              <w:right w:w="100" w:type="dxa"/>
+            </w:tcMar>
+            <w:hideMark/>
+          </w:tcPr>
+          <w:p>
+            <w:pPr>
+              <w:spacing w:after="0" w:line="240" w:lineRule="auto"/>
+              <w:rPr>
+                <w:rFonts w:ascii="Times New Roman" w:eastAsia="Times New Roman" w:hAnsi="Times New Roman" w:cs="Times New Roman"/>
+                <w:kern w:val="0"/>
+                <w:sz w:val="24"/>
+                <w:szCs w:val="24"/>
+                <w:lang w:val="en-US"/>
+                <w14:ligatures w14:val="none"/>
+              </w:rPr>
+            </w:pPr>
+            <w:r>
+              <w:rPr>
+                <w:rFonts w:ascii="Arial" w:eastAsia="Times New Roman" w:hAnsi="Arial" w:cs="Arial"/>
+                <w:color w:val="000000"/>
+                <w:kern w:val="0"/>
+                <w:lang w:val="en-US"/>
+                <w14:ligatures w14:val="none"/>
+              </w:rPr>
+              <w:t>- Báo cáo: II</w:t>
+            </w:r>
+          </w:p>
+          <w:p>
+            <w:pPr>
+              <w:spacing w:after="0" w:line="240" w:lineRule="auto"/>
+              <w:rPr>
+                <w:rFonts w:ascii="Times New Roman" w:eastAsia="Times New Roman" w:hAnsi="Times New Roman" w:cs="Times New Roman"/>
+                <w:kern w:val="0"/>
+                <w:sz w:val="24"/>
+                <w:szCs w:val="24"/>
+                <w:lang w:val="en-US"/>
+                <w14:ligatures w14:val="none"/>
+              </w:rPr>
+            </w:pPr>
+            <w:r>
+              <w:rPr>
+                <w:rFonts w:ascii="Arial" w:eastAsia="Times New Roman" w:hAnsi="Arial" w:cs="Arial"/>
+                <w:color w:val="000000"/>
+                <w:kern w:val="0"/>
+                <w:lang w:val="en-US"/>
+                <w14:ligatures w14:val="none"/>
+              </w:rPr>
+              <w:t>- PPT: tương ứng</w:t>
+            </w:r>
+          </w:p>
+          <w:p>
+            <w:pPr>
+              <w:spacing w:after="0" w:line="240" w:lineRule="auto"/>
+              <w:rPr>
+                <w:rFonts w:ascii="Times New Roman" w:eastAsia="Times New Roman" w:hAnsi="Times New Roman" w:cs="Times New Roman"/>
+                <w:kern w:val="0"/>
+                <w:sz w:val="24"/>
+                <w:szCs w:val="24"/>
+                <w:lang w:val="en-US"/>
+                <w14:ligatures w14:val="none"/>
+              </w:rPr>
+            </w:pPr>
+            <w:r>
+              <w:rPr>
+                <w:rFonts w:ascii="Arial" w:eastAsia="Times New Roman" w:hAnsi="Arial" w:cs="Arial"/>
+                <w:color w:val="000000"/>
+                <w:kern w:val="0"/>
+                <w:lang w:val="en-US"/>
+                <w14:ligatures w14:val="none"/>
+              </w:rPr>
+              <w:t>- Code: tương ứng</w:t>
+            </w:r>
+          </w:p>
+        </w:tc>
+      </w:tr>
+      <w:tr>
+        <w:trPr>
+          <w:trHeight w:val="927"/>
+        </w:trPr>
+        <w:tc>
+          <w:tcPr>
+            <w:tcW w:w="0" w:type="auto"/>
+            <w:tcBorders>
+              <w:top w:val="single" w:sz="8" w:space="0" w:color="000000"/>
+              <w:left w:val="single" w:sz="8" w:space="0" w:color="000000"/>
+              <w:bottom w:val="single" w:sz="8" w:space="0" w:color="000000"/>
+              <w:right w:val="single" w:sz="8" w:space="0" w:color="000000"/>
+            </w:tcBorders>
+            <w:tcMar>
+              <w:top w:w="100" w:type="dxa"/>
+              <w:left w:w="100" w:type="dxa"/>
+              <w:bottom w:w="100" w:type="dxa"/>
+              <w:right w:w="100" w:type="dxa"/>
+            </w:tcMar>
+            <w:hideMark/>
+          </w:tcPr>
+          <w:p>
+            <w:pPr>
+              <w:spacing w:after="0" w:line="240" w:lineRule="auto"/>
+              <w:rPr>
+                <w:rFonts w:ascii="Times New Roman" w:eastAsia="Times New Roman" w:hAnsi="Times New Roman" w:cs="Times New Roman"/>
+                <w:kern w:val="0"/>
+                <w:sz w:val="24"/>
+                <w:szCs w:val="24"/>
+                <w:lang w:val="en-US"/>
+                <w14:ligatures w14:val="none"/>
+              </w:rPr>
+            </w:pPr>
+            <w:r>
+              <w:rPr>
+                <w:rFonts w:ascii="Arial" w:eastAsia="Times New Roman" w:hAnsi="Arial" w:cs="Arial"/>
+                <w:color w:val="000000"/>
+                <w:kern w:val="0"/>
+                <w:lang w:val="en-US"/>
+                <w14:ligatures w14:val="none"/>
+              </w:rPr>
+              <w:t>4</w:t>
+            </w:r>
+          </w:p>
+        </w:tc>
+        <w:tc>
+          <w:tcPr>
+            <w:tcW w:w="0" w:type="auto"/>
+            <w:tcBorders>
+              <w:top w:val="single" w:sz="8" w:space="0" w:color="000000"/>
+              <w:left w:val="single" w:sz="8" w:space="0" w:color="000000"/>
+              <w:bottom w:val="single" w:sz="8" w:space="0" w:color="000000"/>
+              <w:right w:val="single" w:sz="8" w:space="0" w:color="000000"/>
+            </w:tcBorders>
+            <w:tcMar>
+              <w:top w:w="100" w:type="dxa"/>
+              <w:left w:w="100" w:type="dxa"/>
+              <w:bottom w:w="100" w:type="dxa"/>
+              <w:right w:w="100" w:type="dxa"/>
+            </w:tcMar>
+            <w:hideMark/>
+          </w:tcPr>
+          <w:p>
+            <w:pPr>
+              <w:spacing w:after="0" w:line="240" w:lineRule="auto"/>
+              <w:rPr>
+                <w:rFonts w:ascii="Times New Roman" w:eastAsia="Times New Roman" w:hAnsi="Times New Roman" w:cs="Times New Roman"/>
+                <w:kern w:val="0"/>
+                <w:sz w:val="24"/>
+                <w:szCs w:val="24"/>
+                <w:lang w:val="en-US"/>
+                <w14:ligatures w14:val="none"/>
+              </w:rPr>
+            </w:pPr>
+            <w:r>
+              <w:rPr>
+                <w:rFonts w:ascii="Arial" w:eastAsia="Times New Roman" w:hAnsi="Arial" w:cs="Arial"/>
+                <w:color w:val="000000"/>
+                <w:kern w:val="0"/>
+                <w:lang w:val="en-US"/>
+                <w14:ligatures w14:val="none"/>
+              </w:rPr>
+              <w:t>Vũ Văn Toàn</w:t>
+            </w:r>
+          </w:p>
+        </w:tc>
+        <w:tc>
+          <w:tcPr>
+            <w:tcW w:w="0" w:type="auto"/>
+            <w:tcBorders>
+              <w:top w:val="single" w:sz="8" w:space="0" w:color="000000"/>
+              <w:left w:val="single" w:sz="8" w:space="0" w:color="000000"/>
+              <w:bottom w:val="single" w:sz="8" w:space="0" w:color="000000"/>
+              <w:right w:val="single" w:sz="8" w:space="0" w:color="000000"/>
+            </w:tcBorders>
+            <w:tcMar>
+              <w:top w:w="100" w:type="dxa"/>
+              <w:left w:w="100" w:type="dxa"/>
+              <w:bottom w:w="100" w:type="dxa"/>
+              <w:right w:w="100" w:type="dxa"/>
+            </w:tcMar>
+            <w:hideMark/>
+          </w:tcPr>
+          <w:p>
+            <w:pPr>
+              <w:spacing w:after="0" w:line="240" w:lineRule="auto"/>
+              <w:rPr>
+                <w:rFonts w:ascii="Times New Roman" w:eastAsia="Times New Roman" w:hAnsi="Times New Roman" w:cs="Times New Roman"/>
+                <w:kern w:val="0"/>
+                <w:sz w:val="24"/>
+                <w:szCs w:val="24"/>
+                <w:lang w:val="en-US"/>
+                <w14:ligatures w14:val="none"/>
+              </w:rPr>
+            </w:pPr>
+            <w:r>
+              <w:rPr>
+                <w:rFonts w:ascii="Arial" w:eastAsia="Times New Roman" w:hAnsi="Arial" w:cs="Arial"/>
+                <w:color w:val="000000"/>
+                <w:kern w:val="0"/>
+                <w:lang w:val="en-US"/>
+                <w14:ligatures w14:val="none"/>
+              </w:rPr>
+              <w:t>3124410363</w:t>
+            </w:r>
+          </w:p>
+        </w:tc>
+        <w:tc>
+          <w:tcPr>
+            <w:tcW w:w="0" w:type="auto"/>
+            <w:tcBorders>
+              <w:top w:val="single" w:sz="8" w:space="0" w:color="000000"/>
+              <w:left w:val="single" w:sz="8" w:space="0" w:color="000000"/>
+              <w:bottom w:val="single" w:sz="8" w:space="0" w:color="000000"/>
+              <w:right w:val="single" w:sz="8" w:space="0" w:color="000000"/>
+            </w:tcBorders>
+            <w:tcMar>
+              <w:top w:w="100" w:type="dxa"/>
+              <w:left w:w="100" w:type="dxa"/>
+              <w:bottom w:w="100" w:type="dxa"/>
+              <w:right w:w="100" w:type="dxa"/>
+            </w:tcMar>
+            <w:hideMark/>
+          </w:tcPr>
+          <w:p>
+            <w:pPr>
+              <w:spacing w:after="0" w:line="240" w:lineRule="auto"/>
+              <w:rPr>
+                <w:rFonts w:ascii="Times New Roman" w:eastAsia="Times New Roman" w:hAnsi="Times New Roman" w:cs="Times New Roman"/>
+                <w:kern w:val="0"/>
+                <w:sz w:val="24"/>
+                <w:szCs w:val="24"/>
+                <w:lang w:val="en-US"/>
+                <w14:ligatures w14:val="none"/>
+              </w:rPr>
+            </w:pPr>
+            <w:r>
+              <w:rPr>
+                <w:rFonts w:ascii="Arial" w:eastAsia="Times New Roman" w:hAnsi="Arial" w:cs="Arial"/>
+                <w:color w:val="000000"/>
+                <w:kern w:val="0"/>
+                <w:lang w:val="en-US"/>
+                <w14:ligatures w14:val="none"/>
+              </w:rPr>
+              <w:t>- Báo cáo: III</w:t>
+            </w:r>
+          </w:p>
+          <w:p>
+            <w:pPr>
+              <w:spacing w:after="0" w:line="240" w:lineRule="auto"/>
+              <w:rPr>
+                <w:rFonts w:ascii="Times New Roman" w:eastAsia="Times New Roman" w:hAnsi="Times New Roman" w:cs="Times New Roman"/>
+                <w:kern w:val="0"/>
+                <w:sz w:val="24"/>
+                <w:szCs w:val="24"/>
+                <w:lang w:val="en-US"/>
+                <w14:ligatures w14:val="none"/>
+              </w:rPr>
+            </w:pPr>
+            <w:r>
+              <w:rPr>
+                <w:rFonts w:ascii="Arial" w:eastAsia="Times New Roman" w:hAnsi="Arial" w:cs="Arial"/>
+                <w:color w:val="000000"/>
+                <w:kern w:val="0"/>
+                <w:lang w:val="en-US"/>
+                <w14:ligatures w14:val="none"/>
+              </w:rPr>
+              <w:t>- PPT: tương ứng</w:t>
+            </w:r>
+          </w:p>
+          <w:p>
+            <w:pPr>
+              <w:spacing w:after="0" w:line="240" w:lineRule="auto"/>
+              <w:rPr>
+                <w:rFonts w:ascii="Times New Roman" w:eastAsia="Times New Roman" w:hAnsi="Times New Roman" w:cs="Times New Roman"/>
+                <w:kern w:val="0"/>
+                <w:sz w:val="24"/>
+                <w:szCs w:val="24"/>
+                <w:lang w:val="en-US"/>
+                <w14:ligatures w14:val="none"/>
+              </w:rPr>
+            </w:pPr>
+            <w:r>
+              <w:rPr>
+                <w:rFonts w:ascii="Arial" w:eastAsia="Times New Roman" w:hAnsi="Arial" w:cs="Arial"/>
+                <w:color w:val="000000"/>
+                <w:kern w:val="0"/>
+                <w:lang w:val="en-US"/>
+                <w14:ligatures w14:val="none"/>
+              </w:rPr>
+              <w:t>- Code tương ứng</w:t>
+            </w:r>
+          </w:p>
+        </w:tc>
+      </w:tr>
+      <w:tr>
+        <w:trPr>
+          <w:trHeight w:val="948"/>
+        </w:trPr>
+        <w:tc>
+          <w:tcPr>
+            <w:tcW w:w="0" w:type="auto"/>
+            <w:tcBorders>
+              <w:top w:val="single" w:sz="8" w:space="0" w:color="000000"/>
+              <w:left w:val="single" w:sz="8" w:space="0" w:color="000000"/>
+              <w:bottom w:val="single" w:sz="8" w:space="0" w:color="000000"/>
+              <w:right w:val="single" w:sz="8" w:space="0" w:color="000000"/>
+            </w:tcBorders>
+            <w:tcMar>
+              <w:top w:w="100" w:type="dxa"/>
+              <w:left w:w="100" w:type="dxa"/>
+              <w:bottom w:w="100" w:type="dxa"/>
+              <w:right w:w="100" w:type="dxa"/>
+            </w:tcMar>
+            <w:hideMark/>
+          </w:tcPr>
+          <w:p>
+            <w:pPr>
+              <w:spacing w:after="0" w:line="240" w:lineRule="auto"/>
+              <w:rPr>
+                <w:rFonts w:ascii="Times New Roman" w:eastAsia="Times New Roman" w:hAnsi="Times New Roman" w:cs="Times New Roman"/>
+                <w:kern w:val="0"/>
+                <w:sz w:val="24"/>
+                <w:szCs w:val="24"/>
+                <w:lang w:val="en-US"/>
+                <w14:ligatures w14:val="none"/>
+              </w:rPr>
+            </w:pPr>
+            <w:r>
+              <w:rPr>
+                <w:rFonts w:ascii="Arial" w:eastAsia="Times New Roman" w:hAnsi="Arial" w:cs="Arial"/>
+                <w:color w:val="000000"/>
+                <w:kern w:val="0"/>
+                <w:lang w:val="en-US"/>
+                <w14:ligatures w14:val="none"/>
+              </w:rPr>
+              <w:t>5</w:t>
+            </w:r>
+          </w:p>
+        </w:tc>
+        <w:tc>
+          <w:tcPr>
+            <w:tcW w:w="0" w:type="auto"/>
+            <w:tcBorders>
+              <w:top w:val="single" w:sz="8" w:space="0" w:color="000000"/>
+              <w:left w:val="single" w:sz="8" w:space="0" w:color="000000"/>
+              <w:bottom w:val="single" w:sz="8" w:space="0" w:color="000000"/>
+              <w:right w:val="single" w:sz="8" w:space="0" w:color="000000"/>
+            </w:tcBorders>
+            <w:tcMar>
+              <w:top w:w="100" w:type="dxa"/>
+              <w:left w:w="100" w:type="dxa"/>
+              <w:bottom w:w="100" w:type="dxa"/>
+              <w:right w:w="100" w:type="dxa"/>
+            </w:tcMar>
+            <w:hideMark/>
+          </w:tcPr>
+          <w:p>
+            <w:pPr>
+              <w:spacing w:after="0" w:line="240" w:lineRule="auto"/>
+              <w:rPr>
+                <w:rFonts w:ascii="Times New Roman" w:eastAsia="Times New Roman" w:hAnsi="Times New Roman" w:cs="Times New Roman"/>
+                <w:kern w:val="0"/>
+                <w:sz w:val="24"/>
+                <w:szCs w:val="24"/>
+                <w:lang w:val="en-US"/>
+                <w14:ligatures w14:val="none"/>
+              </w:rPr>
+            </w:pPr>
+            <w:r>
+              <w:rPr>
+                <w:rFonts w:ascii="Arial" w:eastAsia="Times New Roman" w:hAnsi="Arial" w:cs="Arial"/>
+                <w:color w:val="000000"/>
+                <w:kern w:val="0"/>
+                <w:lang w:val="en-US"/>
+                <w14:ligatures w14:val="none"/>
+              </w:rPr>
+              <w:t>Lê Quốc Việt</w:t>
+            </w:r>
+          </w:p>
+        </w:tc>
+        <w:tc>
+          <w:tcPr>
+            <w:tcW w:w="0" w:type="auto"/>
+            <w:tcBorders>
+              <w:top w:val="single" w:sz="8" w:space="0" w:color="000000"/>
+              <w:left w:val="single" w:sz="8" w:space="0" w:color="000000"/>
+              <w:bottom w:val="single" w:sz="8" w:space="0" w:color="000000"/>
+              <w:right w:val="single" w:sz="8" w:space="0" w:color="000000"/>
+            </w:tcBorders>
+            <w:tcMar>
+              <w:top w:w="100" w:type="dxa"/>
+              <w:left w:w="100" w:type="dxa"/>
+              <w:bottom w:w="100" w:type="dxa"/>
+              <w:right w:w="100" w:type="dxa"/>
+            </w:tcMar>
+            <w:hideMark/>
+          </w:tcPr>
+          <w:p>
+            <w:pPr>
+              <w:spacing w:after="0" w:line="240" w:lineRule="auto"/>
+              <w:rPr>
+                <w:rFonts w:ascii="Times New Roman" w:eastAsia="Times New Roman" w:hAnsi="Times New Roman" w:cs="Times New Roman"/>
+                <w:kern w:val="0"/>
+                <w:sz w:val="24"/>
+                <w:szCs w:val="24"/>
+                <w:lang w:val="en-US"/>
+                <w14:ligatures w14:val="none"/>
+              </w:rPr>
+            </w:pPr>
+            <w:r>
+              <w:rPr>
+                <w:rFonts w:ascii="Arial" w:eastAsia="Times New Roman" w:hAnsi="Arial" w:cs="Arial"/>
+                <w:color w:val="000000"/>
+                <w:kern w:val="0"/>
+                <w:lang w:val="en-US"/>
+                <w14:ligatures w14:val="none"/>
+              </w:rPr>
+              <w:t>3124410405</w:t>
+            </w:r>
+          </w:p>
+        </w:tc>
+        <w:tc>
+          <w:tcPr>
+            <w:tcW w:w="0" w:type="auto"/>
+            <w:tcBorders>
+              <w:top w:val="single" w:sz="8" w:space="0" w:color="000000"/>
+              <w:left w:val="single" w:sz="8" w:space="0" w:color="000000"/>
+              <w:bottom w:val="single" w:sz="8" w:space="0" w:color="000000"/>
+              <w:right w:val="single" w:sz="8" w:space="0" w:color="000000"/>
+            </w:tcBorders>
+            <w:tcMar>
+              <w:top w:w="100" w:type="dxa"/>
+              <w:left w:w="100" w:type="dxa"/>
+              <w:bottom w:w="100" w:type="dxa"/>
+              <w:right w:w="100" w:type="dxa"/>
+            </w:tcMar>
+            <w:hideMark/>
+          </w:tcPr>
+          <w:p>
+            <w:pPr>
+              <w:spacing w:after="0" w:line="240" w:lineRule="auto"/>
+              <w:rPr>
+                <w:rFonts w:ascii="Times New Roman" w:eastAsia="Times New Roman" w:hAnsi="Times New Roman" w:cs="Times New Roman"/>
+                <w:kern w:val="0"/>
+                <w:sz w:val="24"/>
+                <w:szCs w:val="24"/>
+                <w:lang w:val="en-US"/>
+                <w14:ligatures w14:val="none"/>
+              </w:rPr>
+            </w:pPr>
+            <w:r>
+              <w:rPr>
+                <w:rFonts w:ascii="Arial" w:eastAsia="Times New Roman" w:hAnsi="Arial" w:cs="Arial"/>
+                <w:color w:val="000000"/>
+                <w:kern w:val="0"/>
+                <w:lang w:val="en-US"/>
+                <w14:ligatures w14:val="none"/>
+              </w:rPr>
+              <w:t>- Báo cáo: IV</w:t>
+            </w:r>
+          </w:p>
+          <w:p>
+            <w:pPr>
+              <w:spacing w:after="0" w:line="240" w:lineRule="auto"/>
+              <w:rPr>
+                <w:rFonts w:ascii="Times New Roman" w:eastAsia="Times New Roman" w:hAnsi="Times New Roman" w:cs="Times New Roman"/>
+                <w:kern w:val="0"/>
+                <w:sz w:val="24"/>
+                <w:szCs w:val="24"/>
+                <w:lang w:val="en-US"/>
+                <w14:ligatures w14:val="none"/>
+              </w:rPr>
+            </w:pPr>
+            <w:r>
+              <w:rPr>
+                <w:rFonts w:ascii="Arial" w:eastAsia="Times New Roman" w:hAnsi="Arial" w:cs="Arial"/>
+                <w:color w:val="000000"/>
+                <w:kern w:val="0"/>
+                <w:lang w:val="en-US"/>
+                <w14:ligatures w14:val="none"/>
+              </w:rPr>
+              <w:t>- PPT: tương ứng</w:t>
+            </w:r>
+          </w:p>
+          <w:p>
+            <w:pPr>
+              <w:spacing w:after="0" w:line="240" w:lineRule="auto"/>
+              <w:rPr>
+                <w:rFonts w:ascii="Times New Roman" w:eastAsia="Times New Roman" w:hAnsi="Times New Roman" w:cs="Times New Roman"/>
+                <w:kern w:val="0"/>
+                <w:sz w:val="24"/>
+                <w:szCs w:val="24"/>
+                <w:lang w:val="en-US"/>
+                <w14:ligatures w14:val="none"/>
+              </w:rPr>
+            </w:pPr>
+            <w:r>
+              <w:rPr>
+                <w:rFonts w:ascii="Arial" w:eastAsia="Times New Roman" w:hAnsi="Arial" w:cs="Arial"/>
+                <w:color w:val="000000"/>
+                <w:kern w:val="0"/>
+                <w:lang w:val="en-US"/>
+                <w14:ligatures w14:val="none"/>
+              </w:rPr>
+              <w:t>- Code: tương ứng</w:t>
+            </w:r>
+          </w:p>
+        </w:tc>
+      </w:tr>
+    </w:tbl>
     <w:p>
       <w:pPr>
         <w:pStyle w:val="Kiu1"/>
@@ -2772,8 +4089,6 @@
           <w:docGrid w:linePitch="360"/>
         </w:sectPr>
       </w:pPr>
-      <w:bookmarkStart w:id="1" w:name="_Toc225884702"/>
-      <w:bookmarkStart w:id="2" w:name="_Toc225886506"/>
     </w:p>
     <w:p>
       <w:pPr>
@@ -3296,7 +4611,7 @@
         </w:rPr>
         <w:lastRenderedPageBreak/>
         <w:drawing>
-          <wp:inline distT="0" distB="0" distL="0" distR="0" wp14:anchorId="25F61BFD" wp14:editId="57D3B8D9">
+          <wp:inline distT="0" distB="0" distL="0" distR="0" wp14:anchorId="25F61BFD" wp14:editId="56274F9F">
             <wp:extent cx="5731510" cy="5198745"/>
             <wp:effectExtent l="0" t="0" r="2540" b="1905"/>
             <wp:docPr id="612313884" name="Hình ảnh 8"/>
@@ -3489,7 +4804,7 @@
           <w:bdr w:val="none" w:sz="0" w:space="0" w:color="auto" w:frame="1"/>
         </w:rPr>
         <w:drawing>
-          <wp:inline distT="0" distB="0" distL="0" distR="0" wp14:anchorId="6A274400" wp14:editId="5DF9EBB0">
+          <wp:inline distT="0" distB="0" distL="0" distR="0" wp14:anchorId="6A274400" wp14:editId="2721C8F6">
             <wp:extent cx="5730240" cy="3550920"/>
             <wp:effectExtent l="0" t="0" r="3810" b="0"/>
             <wp:docPr id="850194088" name="Hình ảnh 11"/>
@@ -4815,7 +6130,6 @@
   <w:style w:type="character" w:default="1" w:styleId="DefaultParagraphFont">
     <w:name w:val="Default Paragraph Font"/>
     <w:uiPriority w:val="1"/>
-    <w:semiHidden/>
     <w:unhideWhenUsed/>
   </w:style>
   <w:style w:type="table" w:default="1" w:styleId="TableNormal">

</xml_diff>